<commit_message>
docs: refine five passages in film sound study after editorial review
</commit_message>
<xml_diff>
--- a/docs/files/motion/film-sound-storytelling/originals/report.docx
+++ b/docs/files/motion/film-sound-storytelling/originals/report.docx
@@ -47,7 +47,7 @@
     </w:p>
     <w:p>
       <w:r>
-        <w:t>这篇文章讨论的就是这种能力。我们会从几个容易混淆的概念出发，走到两段完整的原创场景：一段雨夜 MV，以及一条玩家可以反复经过的恐怖游戏走廊。电影案例只用于说明已有创作者做过的选择；示例中的剧情、时间和混音方案都是为本文设计的，不是复刻电影音轨。</w:t>
+        <w:t>文中的电影案例用于说明已有创作者的选择；后面的雨夜 MV 与可反复经过的恐怖游戏走廊则是两段完整的原创场景，剧情、时间安排和混音方案均为本文设计，并未复刻电影音轨。</w:t>
       </w:r>
     </w:p>
     <w:p>
@@ -334,7 +334,7 @@
     </w:p>
     <w:p>
       <w:r>
-        <w:t>这个案例可以引出一个创作判断：当观众与角色共享某种听觉限制，危险未必需要更响。画面提供一个角色无法从声音获知的威胁，就能制造信息上的不对称。我们知道他不知道什么。</w:t>
+        <w:t>这个案例可以引出一个创作判断：当观众与角色共享某种听觉限制，危险未必需要更响。画面提供一个角色无法从声音获知的威胁，就能制造信息上的不对称。</w:t>
       </w:r>
     </w:p>
     <w:p>
@@ -499,7 +499,7 @@
     </w:p>
     <w:p>
       <w:r>
-        <w:t>“先静后响”能造成惊跳，却不自动产生长久的恐惧。若每次安静之后都跟着巨响，安静会变成倒计时。更耐看的安排可以让预期落空：窗帘动了，听见的只是窗外一辆车；角色松手时，那把早已入镜的钥匙却在桌面上滚动。真正发生的事没有完全服从先前的提示。</w:t>
+        <w:t>“先静后响”能造成惊跳，却不自动产生长久的恐惧。若每次安静之后都跟着巨响，安静会变成倒计时。更耐看的安排可以让预期落空：窗帘动了，听见的只是窗外一辆车；角色松手时，那把早已入镜的钥匙却在桌面上滚动。</w:t>
       </w:r>
     </w:p>
     <w:p>
@@ -1325,12 +1325,12 @@
     </w:p>
     <w:p>
       <w:r>
-        <w:t>列车经过的段落最容易过度制作。若整段列车声压住人声，只因为它在现实里很响，就会让歌曲失去中心。更合适的安排可能是把列车最明显的轮轨纹理留在人声停顿里，让风压或较柔和的持续成分跨过唱句。这里的真实感是选择后的真实感。人物和列车的关系要被理解，未必需要每个频段都按现场比例重现。</w:t>
+        <w:t>列车经过的段落最容易过度制作。若整段列车声压住人声，只因为它在现实里很响，就会让歌曲失去中心。更合适的安排可能是把列车最明显的轮轨纹理留在人声停顿里，让风压或较柔和的持续成分跨过唱句。人物和列车的关系要被理解，未必需要每个频段都按现场比例重现。</w:t>
       </w:r>
     </w:p>
     <w:p>
       <w:r>
-        <w:t>如果只有已经完成的立体声歌曲，没有人声与伴奏分轨，不能假装可以无损地单独挪开一件乐器。可以选择更少的效果、找歌曲自身的空隙，或对整段音乐做轻微自动化。若进一步分离音源，可能带来残留和音质变化，需要听过结果再决定是否值得。素材条件会直接改变可行的设计。</w:t>
+        <w:t>如果只有已经完成的立体声歌曲，没有人声与伴奏分轨，不能假装可以无损地单独挪开一件乐器。可以选择更少的效果、找歌曲自身的空隙，或对整段音乐做轻微自动化。若进一步分离音源，可能带来残留和音质变化，需要听过结果再决定是否值得。</w:t>
       </w:r>
     </w:p>
     <w:p>

</xml_diff>